<commit_message>
chore: update multiple project files
</commit_message>
<xml_diff>
--- a/doc/informe.docx
+++ b/doc/informe.docx
@@ -14,7 +14,7 @@
         <w:rPr>
           <w:rFonts w:cs="Calibri"/>
         </w:rPr>
-        <w:t xml:space="preserve">Ica, 23 de septiembre de 2026</w:t>
+        <w:t xml:space="preserve">Ica, 24 de septiembre de 2026</w:t>
       </w:r>
       <w:r>
         <w:rPr>
@@ -81,7 +81,7 @@
           <w:rFonts w:cs="Calibri"/>
           <w:b/>
         </w:rPr>
-        <w:t>ASUNTO: FACTIBILIDAD AMPLIACION DE CARGA, San Fernando S.A (RUC 20100154308).</w:t>
+        <w:t>ASUNTO:FACTIBILIDAD AMPLIACION DE CARGA, MUNICIPAL DE AGUA POTABLE Y ALCANTARILLADO DE ICA S.A. - EMAPICA.</w:t>
       </w:r>
       <w:r>
         <w:rPr>
@@ -246,7 +246,7 @@
         <w:pStyle w:val="Normal2"/>
       </w:pPr>
       <w:r>
-        <w:t xml:space="preserve">La Unidad de Proyectos y Obras distribución solicita evaluación de Solicitud de factibilidad y punto de diseño en media tensión, predio ubicado en Sector Santa Fe de Lanchas,  Unidad Catastral 72869, distrito de Paracas, provincia de Pisco y departamento de Ica.</w:t>
+        <w:t xml:space="preserve">La Unidad de Proyectos y Obras distribución solicita evaluación de Factibilidad y Punto de Diseño en media tensión, predio ubicado en Electro Dunas.</w:t>
       </w:r>
       <w:r>
         <w:t/>
@@ -278,7 +278,7 @@
         <w:pStyle w:val="Normal2"/>
       </w:pPr>
       <w:r>
-        <w:t xml:space="preserve">La solicitud esta registrado con CARTA G T-SU-966-2026/PO</w:t>
+        <w:t xml:space="preserve">La solicitud esta registrado con RECYM-CA101</w:t>
       </w:r>
       <w:r>
         <w:t/>
@@ -307,7 +307,7 @@
         <w:pStyle w:val="Normal2"/>
       </w:pPr>
       <w:r>
-        <w:t xml:space="preserve">El interesado solicita Factibilidad y Punto de Diseño 1420 kW.</w:t>
+        <w:t xml:space="preserve">El interesado solicita Factibilidad y Punto de Diseño —.</w:t>
       </w:r>
       <w:r>
         <w:t/>
@@ -336,7 +336,7 @@
         <w:pStyle w:val="Normal2"/>
       </w:pPr>
       <w:r>
-        <w:t xml:space="preserve">El interesado se encuentra próximo al alimentador PA217.</w:t>
+        <w:t xml:space="preserve">El interesado se encuentra próximo al alimentador CA101.</w:t>
       </w:r>
       <w:r>
         <w:t/>
@@ -374,7 +374,7 @@
         <w:pStyle w:val="Normal2"/>
       </w:pPr>
       <w:r>
-        <w:t xml:space="preserve">El transformador de la SET Paracas tiene las siguientes características Transformador SET Paracas · 22.9 kV (inventario CYMDIST).</w:t>
+        <w:t xml:space="preserve">El transformador de la SET CA101 tiene las siguientes características Transformador SET CA101 · 10.0 kV (inventario CYMDIST).</w:t>
       </w:r>
       <w:r>
         <w:t/>
@@ -455,7 +455,7 @@
         </w:rPr>
       </w:pPr>
       <w:r>
-        <w:t xml:space="preserve">Se ha verificado que el interesado se encuentra dentro de área de la zona de influencia del alimentador PA217</w:t>
+        <w:t xml:space="preserve">Se ha verificado que el interesado se encuentra dentro de área de la zona de influencia del alimentador CA101</w:t>
       </w:r>
       <w:r>
         <w:t xml:space="preserve"/>
@@ -838,7 +838,7 @@
               </w:rPr>
             </w:pPr>
             <w:r>
-              <w:t>6498</w:t>
+              <w:t>3022</w:t>
             </w:r>
           </w:p>
         </w:tc>
@@ -857,7 +857,7 @@
               </w:rPr>
             </w:pPr>
             <w:r>
-              <w:t>1777</w:t>
+              <w:t>301</w:t>
             </w:r>
           </w:p>
         </w:tc>
@@ -881,7 +881,7 @@
                 <w:rFonts w:cs="Calibri"/>
                 <w:color w:val="000000"/>
               </w:rPr>
-              <w:t>6736.60</w:t>
+              <w:t>3036.95</w:t>
             </w:r>
           </w:p>
         </w:tc>
@@ -907,7 +907,7 @@
                 <w:bCs/>
                 <w:color w:val="000000"/>
               </w:rPr>
-              <w:t>96,46</w:t>
+              <w:t>99,51</w:t>
             </w:r>
             <w:r>
               <w:rPr>
@@ -1057,7 +1057,6 @@
     </w:p>
     <w:p>
       <w:pPr>
-        <w:spacing w:after="120" w:line="240" w:lineRule="auto"/>
         <w:pStyle w:val="Normal2"/>
       </w:pPr>
       <w:r>
@@ -1102,9 +1101,17 @@
           <w:rFonts w:cs="Calibri"/>
         </w:rPr>
         <w:drawing>
-          <wp:inline distT="0" distB="0" distL="0" distR="0">
+          <wp:anchor distT="0" distB="0" distL="114300" distR="114300" simplePos="0" relativeHeight="251644416" behindDoc="1" locked="0" layoutInCell="1" allowOverlap="1" wp14:anchorId="7382B468" wp14:editId="5BEB61AC">
+            <wp:simplePos x="0" y="0"/>
+            <wp:positionH relativeFrom="column">
+              <wp:posOffset>1780540</wp:posOffset>
+            </wp:positionH>
+            <wp:positionV relativeFrom="paragraph">
+              <wp:posOffset>21590</wp:posOffset>
+            </wp:positionV>
             <wp:extent cx="3208020" cy="1390650"/>
             <wp:effectExtent l="19050" t="19050" r="11430" b="19050"/>
+            <wp:wrapSquare wrapText="bothSides"/>
             <wp:docPr id="216957388" name="Imagen 1"/>
             <wp:cNvGraphicFramePr>
               <a:graphicFrameLocks xmlns:a="http://schemas.openxmlformats.org/drawingml/2006/main" noChangeAspect="1"/>
@@ -1145,7 +1152,13 @@
                 </pic:pic>
               </a:graphicData>
             </a:graphic>
-          </wp:inline>
+            <wp14:sizeRelH relativeFrom="margin">
+              <wp14:pctWidth>0</wp14:pctWidth>
+            </wp14:sizeRelH>
+            <wp14:sizeRelV relativeFrom="margin">
+              <wp14:pctHeight>0</wp14:pctHeight>
+            </wp14:sizeRelV>
+          </wp:anchor>
         </w:drawing>
       </w:r>
     </w:p>
@@ -1166,6 +1179,66 @@
         <w:jc w:val="both"/>
         <w:rPr>
           <w:rFonts w:cs="Calibri"/>
+        </w:rPr>
+      </w:pPr>
+    </w:p>
+    <w:p>
+      <w:pPr>
+        <w:spacing w:after="0" w:line="240" w:lineRule="auto"/>
+        <w:ind w:left="709"/>
+        <w:jc w:val="both"/>
+        <w:rPr>
+          <w:rFonts w:cs="Calibri"/>
+        </w:rPr>
+      </w:pPr>
+    </w:p>
+    <w:p>
+      <w:pPr>
+        <w:spacing w:after="0" w:line="240" w:lineRule="auto"/>
+        <w:ind w:left="709"/>
+        <w:jc w:val="both"/>
+        <w:rPr>
+          <w:rFonts w:cs="Calibri"/>
+        </w:rPr>
+      </w:pPr>
+    </w:p>
+    <w:p>
+      <w:pPr>
+        <w:spacing w:after="0" w:line="240" w:lineRule="auto"/>
+        <w:ind w:left="709"/>
+        <w:jc w:val="both"/>
+        <w:rPr>
+          <w:rFonts w:cs="Calibri"/>
+        </w:rPr>
+      </w:pPr>
+    </w:p>
+    <w:p>
+      <w:pPr>
+        <w:spacing w:after="0" w:line="240" w:lineRule="auto"/>
+        <w:ind w:left="709"/>
+        <w:jc w:val="both"/>
+        <w:rPr>
+          <w:rFonts w:cs="Calibri"/>
+        </w:rPr>
+      </w:pPr>
+    </w:p>
+    <w:p>
+      <w:pPr>
+        <w:spacing w:after="0" w:line="240" w:lineRule="auto"/>
+        <w:ind w:left="709"/>
+        <w:jc w:val="both"/>
+        <w:rPr>
+          <w:rFonts w:cs="Calibri"/>
+        </w:rPr>
+      </w:pPr>
+    </w:p>
+    <w:p>
+      <w:pPr>
+        <w:spacing w:after="0" w:line="240" w:lineRule="auto"/>
+        <w:ind w:left="709"/>
+        <w:jc w:val="both"/>
+        <w:rPr>
+          <w:rFonts w:cs="Calibri"/>
           <w:b/>
         </w:rPr>
       </w:pPr>
@@ -1174,9 +1247,17 @@
           <w:rFonts w:cs="Calibri"/>
         </w:rPr>
         <w:drawing>
-          <wp:inline distT="0" distB="0" distL="0" distR="0">
+          <wp:anchor distT="0" distB="0" distL="114300" distR="114300" simplePos="0" relativeHeight="251619840" behindDoc="1" locked="0" layoutInCell="1" allowOverlap="1" wp14:anchorId="2A4FDCBA" wp14:editId="738182FB">
+            <wp:simplePos x="0" y="0"/>
+            <wp:positionH relativeFrom="column">
+              <wp:posOffset>1463675</wp:posOffset>
+            </wp:positionH>
+            <wp:positionV relativeFrom="paragraph">
+              <wp:posOffset>125730</wp:posOffset>
+            </wp:positionV>
             <wp:extent cx="3745230" cy="2752090"/>
             <wp:effectExtent l="19050" t="19050" r="26670" b="10160"/>
+            <wp:wrapSquare wrapText="bothSides"/>
             <wp:docPr id="866581284" name="Imagen 1"/>
             <wp:cNvGraphicFramePr>
               <a:graphicFrameLocks xmlns:a="http://schemas.openxmlformats.org/drawingml/2006/main" noChangeAspect="1"/>
@@ -1217,7 +1298,13 @@
                 </pic:pic>
               </a:graphicData>
             </a:graphic>
-          </wp:inline>
+            <wp14:sizeRelH relativeFrom="margin">
+              <wp14:pctWidth>0</wp14:pctWidth>
+            </wp14:sizeRelH>
+            <wp14:sizeRelV relativeFrom="margin">
+              <wp14:pctHeight>0</wp14:pctHeight>
+            </wp14:sizeRelV>
+          </wp:anchor>
         </w:drawing>
       </w:r>
     </w:p>
@@ -1605,7 +1692,7 @@
                 <w:szCs w:val="20"/>
                 <w:lang w:eastAsia="es-PE"/>
               </w:rPr>
-              <w:t>99.84%</w:t>
+              <w:t>80.20%</w:t>
             </w:r>
           </w:p>
         </w:tc>
@@ -1685,7 +1772,7 @@
                 <w:szCs w:val="20"/>
                 <w:lang w:eastAsia="es-PE"/>
               </w:rPr>
-              <w:t>99.84%</w:t>
+              <w:t>80.20%</w:t>
             </w:r>
           </w:p>
         </w:tc>
@@ -1765,7 +1852,7 @@
                 <w:szCs w:val="20"/>
                 <w:lang w:eastAsia="es-PE"/>
               </w:rPr>
-              <w:t>99.84%</w:t>
+              <w:t>80.20%</w:t>
             </w:r>
           </w:p>
         </w:tc>
@@ -1781,77 +1868,6 @@
     </w:p>
     <w:p>
       <w:pPr>
-        <w:spacing w:after="120" w:line="240" w:lineRule="auto"/>
-        <w:ind w:left="709"/>
-        <w:jc w:val="both"/>
-        <w:rPr>
-          <w:rFonts w:cs="Calibri"/>
-        </w:rPr>
-      </w:pPr>
-      <w:r>
-        <w:rPr>
-          <w:rFonts w:cs="Calibri"/>
-        </w:rPr>
-        <w:t xml:space="preserve">De acuerdo con el cuadro de colores que resulta del flujo realizado el alimentador no presenta problemas de cargabilidad, la red de color azul se encuentra por debajo del 80% de la cargabilidad del conductor.</w:t>
-      </w:r>
-      <w:proofErr w:type="spellStart"/>
-      <w:r>
-        <w:rPr>
-          <w:rFonts w:cs="Calibri"/>
-        </w:rPr>
-        <w:t/>
-      </w:r>
-      <w:proofErr w:type="spellEnd"/>
-      <w:r>
-        <w:rPr>
-          <w:rFonts w:cs="Calibri"/>
-        </w:rPr>
-        <w:t/>
-      </w:r>
-      <w:r>
-        <w:rPr>
-          <w:rFonts w:cs="Calibri"/>
-        </w:rPr>
-        <w:t/>
-      </w:r>
-      <w:r>
-        <w:t xml:space="preserve"/>
-      </w:r>
-      <w:r>
-        <w:rPr>
-          <w:rFonts w:cs="Calibri"/>
-        </w:rPr>
-        <w:t xml:space="preserve"/>
-      </w:r>
-      <w:r>
-        <w:rPr>
-          <w:rFonts w:cs="Calibri"/>
-        </w:rPr>
-        <w:t xml:space="preserve"/>
-      </w:r>
-      <w:proofErr w:type="spellStart"/>
-      <w:r>
-        <w:rPr>
-          <w:rFonts w:cs="Calibri"/>
-        </w:rPr>
-        <w:t/>
-      </w:r>
-      <w:proofErr w:type="spellEnd"/>
-      <w:r>
-        <w:rPr>
-          <w:rFonts w:cs="Calibri"/>
-        </w:rPr>
-        <w:t xml:space="preserve"/>
-      </w:r>
-      <w:r>
-        <w:rPr>
-          <w:rFonts w:cs="Calibri"/>
-        </w:rPr>
-        <w:t/>
-      </w:r>
-    </w:p>
-    <w:p>
-      <w:pPr>
         <w:spacing w:after="0" w:line="240" w:lineRule="auto"/>
         <w:ind w:left="709"/>
         <w:jc w:val="both"/>
@@ -1863,11 +1879,90 @@
         <w:rPr>
           <w:rFonts w:cs="Calibri"/>
         </w:rPr>
+        <w:t xml:space="preserve">De acuerdo con el cuadro de colores que resulta del flujo realizado el alimentador no presenta problemas de cargabilidad, la red de color azul se encuentra por debajo del 80% de la cargabilidad del conductor.</w:t>
+      </w:r>
+      <w:proofErr w:type="spellStart"/>
+      <w:r>
+        <w:rPr>
+          <w:rFonts w:cs="Calibri"/>
+        </w:rPr>
+        <w:t/>
+      </w:r>
+      <w:proofErr w:type="spellEnd"/>
+      <w:r>
+        <w:rPr>
+          <w:rFonts w:cs="Calibri"/>
+        </w:rPr>
+        <w:t/>
+      </w:r>
+      <w:r>
+        <w:rPr>
+          <w:rFonts w:cs="Calibri"/>
+        </w:rPr>
+        <w:t/>
+      </w:r>
+      <w:r>
+        <w:t xml:space="preserve"/>
+      </w:r>
+      <w:r>
+        <w:rPr>
+          <w:rFonts w:cs="Calibri"/>
+        </w:rPr>
+        <w:t xml:space="preserve"/>
+      </w:r>
+      <w:r>
+        <w:rPr>
+          <w:rFonts w:cs="Calibri"/>
+        </w:rPr>
+        <w:t xml:space="preserve"/>
+      </w:r>
+      <w:proofErr w:type="spellStart"/>
+      <w:r>
+        <w:rPr>
+          <w:rFonts w:cs="Calibri"/>
+        </w:rPr>
+        <w:t/>
+      </w:r>
+      <w:proofErr w:type="spellEnd"/>
+      <w:r>
+        <w:rPr>
+          <w:rFonts w:cs="Calibri"/>
+        </w:rPr>
+        <w:t xml:space="preserve"/>
+      </w:r>
+      <w:r>
+        <w:rPr>
+          <w:rFonts w:cs="Calibri"/>
+        </w:rPr>
+        <w:t/>
+      </w:r>
+    </w:p>
+    <w:p>
+      <w:pPr>
+        <w:spacing w:after="0" w:line="240" w:lineRule="auto"/>
+        <w:ind w:left="709"/>
+        <w:jc w:val="both"/>
+        <w:rPr>
+          <w:rFonts w:cs="Calibri"/>
+        </w:rPr>
+      </w:pPr>
+      <w:r>
+        <w:rPr>
+          <w:rFonts w:cs="Calibri"/>
+        </w:rPr>
         <w:lastRenderedPageBreak/>
         <w:drawing>
-          <wp:inline distT="0" distB="0" distL="0" distR="0">
+          <wp:anchor distT="0" distB="0" distL="114300" distR="114300" simplePos="0" relativeHeight="251701760" behindDoc="1" locked="0" layoutInCell="1" allowOverlap="1" wp14:anchorId="0F59EE71" wp14:editId="3D5BA817">
+            <wp:simplePos x="0" y="0"/>
+            <wp:positionH relativeFrom="margin">
+              <wp:posOffset>1540510</wp:posOffset>
+            </wp:positionH>
+            <wp:positionV relativeFrom="paragraph">
+              <wp:posOffset>19685</wp:posOffset>
+            </wp:positionV>
             <wp:extent cx="3135630" cy="1630045"/>
             <wp:effectExtent l="19050" t="19050" r="26670" b="27305"/>
+            <wp:wrapSquare wrapText="bothSides"/>
             <wp:docPr id="1284147032" name="Imagen 1"/>
             <wp:cNvGraphicFramePr>
               <a:graphicFrameLocks xmlns:a="http://schemas.openxmlformats.org/drawingml/2006/main" noChangeAspect="1"/>
@@ -1908,7 +2003,13 @@
                 </pic:pic>
               </a:graphicData>
             </a:graphic>
-          </wp:inline>
+            <wp14:sizeRelH relativeFrom="margin">
+              <wp14:pctWidth>0</wp14:pctWidth>
+            </wp14:sizeRelH>
+            <wp14:sizeRelV relativeFrom="margin">
+              <wp14:pctHeight>0</wp14:pctHeight>
+            </wp14:sizeRelV>
+          </wp:anchor>
         </w:drawing>
       </w:r>
     </w:p>
@@ -1931,14 +2032,92 @@
           <w:rFonts w:cs="Calibri"/>
         </w:rPr>
       </w:pPr>
+    </w:p>
+    <w:p>
+      <w:pPr>
+        <w:spacing w:after="0" w:line="240" w:lineRule="auto"/>
+        <w:ind w:left="709"/>
+        <w:jc w:val="both"/>
+        <w:rPr>
+          <w:rFonts w:cs="Calibri"/>
+        </w:rPr>
+      </w:pPr>
+    </w:p>
+    <w:p>
+      <w:pPr>
+        <w:spacing w:after="0" w:line="240" w:lineRule="auto"/>
+        <w:ind w:left="709"/>
+        <w:jc w:val="both"/>
+        <w:rPr>
+          <w:rFonts w:cs="Calibri"/>
+        </w:rPr>
+      </w:pPr>
+    </w:p>
+    <w:p>
+      <w:pPr>
+        <w:spacing w:after="0" w:line="240" w:lineRule="auto"/>
+        <w:ind w:left="709"/>
+        <w:jc w:val="both"/>
+        <w:rPr>
+          <w:rFonts w:cs="Calibri"/>
+        </w:rPr>
+      </w:pPr>
+    </w:p>
+    <w:p>
+      <w:pPr>
+        <w:spacing w:after="0" w:line="240" w:lineRule="auto"/>
+        <w:ind w:left="709"/>
+        <w:jc w:val="both"/>
+        <w:rPr>
+          <w:rFonts w:cs="Calibri"/>
+        </w:rPr>
+      </w:pPr>
+    </w:p>
+    <w:p>
+      <w:pPr>
+        <w:spacing w:after="0" w:line="240" w:lineRule="auto"/>
+        <w:ind w:left="709"/>
+        <w:jc w:val="both"/>
+        <w:rPr>
+          <w:rFonts w:cs="Calibri"/>
+        </w:rPr>
+      </w:pPr>
+    </w:p>
+    <w:p>
+      <w:pPr>
+        <w:spacing w:after="0" w:line="240" w:lineRule="auto"/>
+        <w:ind w:left="709"/>
+        <w:jc w:val="both"/>
+        <w:rPr>
+          <w:rFonts w:cs="Calibri"/>
+        </w:rPr>
+      </w:pPr>
+    </w:p>
+    <w:p>
+      <w:pPr>
+        <w:spacing w:after="0" w:line="240" w:lineRule="auto"/>
+        <w:ind w:left="709"/>
+        <w:jc w:val="both"/>
+        <w:rPr>
+          <w:rFonts w:cs="Calibri"/>
+        </w:rPr>
+      </w:pPr>
       <w:r>
         <w:rPr>
           <w:rFonts w:cs="Calibri"/>
         </w:rPr>
         <w:drawing>
-          <wp:inline distT="0" distB="0" distL="0" distR="0">
+          <wp:anchor distT="0" distB="0" distL="114300" distR="114300" simplePos="0" relativeHeight="251707904" behindDoc="0" locked="0" layoutInCell="1" allowOverlap="1" wp14:anchorId="30E352C8" wp14:editId="0A5F07B2">
+            <wp:simplePos x="0" y="0"/>
+            <wp:positionH relativeFrom="column">
+              <wp:posOffset>523240</wp:posOffset>
+            </wp:positionH>
+            <wp:positionV relativeFrom="paragraph">
+              <wp:posOffset>236220</wp:posOffset>
+            </wp:positionV>
             <wp:extent cx="5513992" cy="3213100"/>
             <wp:effectExtent l="19050" t="19050" r="10795" b="25400"/>
+            <wp:wrapSquare wrapText="bothSides"/>
             <wp:docPr id="7135825" name="Imagen 1"/>
             <wp:cNvGraphicFramePr>
               <a:graphicFrameLocks xmlns:a="http://schemas.openxmlformats.org/drawingml/2006/main" noChangeAspect="1"/>
@@ -1979,7 +2158,7 @@
                 </pic:pic>
               </a:graphicData>
             </a:graphic>
-          </wp:inline>
+          </wp:anchor>
         </w:drawing>
       </w:r>
     </w:p>
@@ -2272,7 +2451,7 @@
                 <w:sz w:val="20"/>
                 <w:szCs w:val="20"/>
               </w:rPr>
-              <w:t>6498</w:t>
+              <w:t>3233.12</w:t>
             </w:r>
           </w:p>
         </w:tc>
@@ -2301,7 +2480,7 @@
                 <w:sz w:val="20"/>
                 <w:szCs w:val="20"/>
               </w:rPr>
-              <w:t>1777</w:t>
+              <w:t>1156.66</w:t>
             </w:r>
           </w:p>
         </w:tc>
@@ -2330,7 +2509,7 @@
                 <w:sz w:val="20"/>
                 <w:szCs w:val="20"/>
               </w:rPr>
-              <w:t>6736.60</w:t>
+              <w:t>3433.79</w:t>
             </w:r>
           </w:p>
         </w:tc>
@@ -2359,7 +2538,7 @@
                 <w:sz w:val="20"/>
                 <w:szCs w:val="20"/>
               </w:rPr>
-              <w:t>96,46</w:t>
+              <w:t>94,16</w:t>
             </w:r>
           </w:p>
         </w:tc>
@@ -2412,7 +2591,7 @@
                 <w:sz w:val="20"/>
                 <w:szCs w:val="20"/>
               </w:rPr>
-              <w:t>—</w:t>
+              <w:t>51.12</w:t>
             </w:r>
           </w:p>
         </w:tc>
@@ -2437,7 +2616,7 @@
                 <w:sz w:val="20"/>
                 <w:szCs w:val="20"/>
               </w:rPr>
-              <w:t>—</w:t>
+              <w:t>71.09</w:t>
             </w:r>
           </w:p>
         </w:tc>
@@ -2462,7 +2641,7 @@
                 <w:sz w:val="20"/>
                 <w:szCs w:val="20"/>
               </w:rPr>
-              <w:t>—</w:t>
+              <w:t>87.56</w:t>
             </w:r>
           </w:p>
         </w:tc>
@@ -2487,7 +2666,7 @@
                 <w:sz w:val="20"/>
                 <w:szCs w:val="20"/>
               </w:rPr>
-              <w:t>—</w:t>
+              <w:t>58.38</w:t>
             </w:r>
           </w:p>
         </w:tc>
@@ -2895,7 +3074,7 @@
                 <w:color w:val="000000"/>
                 <w:lang w:eastAsia="es-PE"/>
               </w:rPr>
-              <w:t>1.00</w:t>
+              <w:t>0.99</w:t>
             </w:r>
           </w:p>
         </w:tc>
@@ -2928,7 +3107,7 @@
                 <w:color w:val="000000"/>
                 <w:lang w:eastAsia="es-PE"/>
               </w:rPr>
-              <w:t>22.9</w:t>
+              <w:t>9.9</w:t>
             </w:r>
           </w:p>
         </w:tc>
@@ -2961,7 +3140,7 @@
                 <w:color w:val="000000"/>
                 <w:lang w:eastAsia="es-PE"/>
               </w:rPr>
-              <w:t>13.2</w:t>
+              <w:t>5.7</w:t>
             </w:r>
           </w:p>
         </w:tc>
@@ -2994,7 +3173,7 @@
                 <w:color w:val="000000"/>
                 <w:lang w:eastAsia="es-PE"/>
               </w:rPr>
-              <w:t>37.7</w:t>
+              <w:t>27.1</w:t>
             </w:r>
           </w:p>
         </w:tc>
@@ -3027,7 +3206,7 @@
                 <w:color w:val="000000"/>
                 <w:lang w:eastAsia="es-PE"/>
               </w:rPr>
-              <w:t>1495</w:t>
+              <w:t>455</w:t>
             </w:r>
           </w:p>
         </w:tc>
@@ -3060,7 +3239,7 @@
                 <w:color w:val="000000"/>
                 <w:lang w:eastAsia="es-PE"/>
               </w:rPr>
-              <w:t>1420</w:t>
+              <w:t>430</w:t>
             </w:r>
           </w:p>
         </w:tc>
@@ -3093,7 +3272,7 @@
                 <w:color w:val="000000"/>
                 <w:lang w:eastAsia="es-PE"/>
               </w:rPr>
-              <w:t>467</w:t>
+              <w:t>142</w:t>
             </w:r>
           </w:p>
         </w:tc>
@@ -3145,11 +3324,23 @@
     </w:p>
     <w:p>
       <w:pPr>
-        <w:spacing w:after="120" w:line="240" w:lineRule="auto"/>
+        <w:spacing w:after="0" w:line="240" w:lineRule="auto"/>
         <w:ind w:left="709"/>
         <w:jc w:val="both"/>
         <w:rPr>
           <w:rFonts w:cs="Calibri"/>
+          <w:b/>
+          <w:bCs/>
+        </w:rPr>
+      </w:pPr>
+    </w:p>
+    <w:p>
+      <w:pPr>
+        <w:spacing w:after="0" w:line="240" w:lineRule="auto"/>
+        <w:ind w:left="709"/>
+        <w:jc w:val="both"/>
+        <w:rPr>
+          <w:rFonts w:cs="Calibri"/>
         </w:rPr>
       </w:pPr>
       <w:r>
@@ -3222,9 +3413,17 @@
           <w:b/>
         </w:rPr>
         <w:drawing>
-          <wp:inline distT="0" distB="0" distL="0" distR="0">
+          <wp:anchor distT="0" distB="0" distL="114300" distR="114300" simplePos="0" relativeHeight="251727360" behindDoc="1" locked="0" layoutInCell="1" allowOverlap="1" wp14:anchorId="5F133407" wp14:editId="5FE729FB">
+            <wp:simplePos x="0" y="0"/>
+            <wp:positionH relativeFrom="margin">
+              <wp:posOffset>1599911</wp:posOffset>
+            </wp:positionH>
+            <wp:positionV relativeFrom="margin">
+              <wp:posOffset>813186</wp:posOffset>
+            </wp:positionV>
             <wp:extent cx="3149600" cy="1830070"/>
             <wp:effectExtent l="19050" t="19050" r="12700" b="17780"/>
+            <wp:wrapSquare wrapText="bothSides"/>
             <wp:docPr id="41836164" name="Imagen 1"/>
             <wp:cNvGraphicFramePr>
               <a:graphicFrameLocks xmlns:a="http://schemas.openxmlformats.org/drawingml/2006/main" noChangeAspect="1"/>
@@ -3265,9 +3464,115 @@
                 </pic:pic>
               </a:graphicData>
             </a:graphic>
-          </wp:inline>
+            <wp14:sizeRelH relativeFrom="page">
+              <wp14:pctWidth>0</wp14:pctWidth>
+            </wp14:sizeRelH>
+            <wp14:sizeRelV relativeFrom="page">
+              <wp14:pctHeight>0</wp14:pctHeight>
+            </wp14:sizeRelV>
+          </wp:anchor>
         </w:drawing>
       </w:r>
+    </w:p>
+    <w:p>
+      <w:pPr>
+        <w:spacing w:after="0" w:line="240" w:lineRule="auto"/>
+        <w:ind w:left="709"/>
+        <w:rPr>
+          <w:rFonts w:cs="Calibri"/>
+          <w:b/>
+        </w:rPr>
+      </w:pPr>
+    </w:p>
+    <w:p>
+      <w:pPr>
+        <w:spacing w:after="0" w:line="240" w:lineRule="auto"/>
+        <w:ind w:left="709"/>
+        <w:rPr>
+          <w:rFonts w:cs="Calibri"/>
+          <w:b/>
+        </w:rPr>
+      </w:pPr>
+    </w:p>
+    <w:p>
+      <w:pPr>
+        <w:spacing w:after="0" w:line="240" w:lineRule="auto"/>
+        <w:ind w:left="709"/>
+        <w:rPr>
+          <w:rFonts w:cs="Calibri"/>
+          <w:b/>
+        </w:rPr>
+      </w:pPr>
+    </w:p>
+    <w:p>
+      <w:pPr>
+        <w:spacing w:after="0" w:line="240" w:lineRule="auto"/>
+        <w:ind w:left="709"/>
+        <w:rPr>
+          <w:rFonts w:cs="Calibri"/>
+          <w:b/>
+        </w:rPr>
+      </w:pPr>
+    </w:p>
+    <w:p>
+      <w:pPr>
+        <w:spacing w:after="0" w:line="240" w:lineRule="auto"/>
+        <w:ind w:left="709"/>
+        <w:rPr>
+          <w:rFonts w:cs="Calibri"/>
+          <w:b/>
+        </w:rPr>
+      </w:pPr>
+    </w:p>
+    <w:p>
+      <w:pPr>
+        <w:spacing w:after="0" w:line="240" w:lineRule="auto"/>
+        <w:ind w:left="709"/>
+        <w:rPr>
+          <w:rFonts w:cs="Calibri"/>
+          <w:b/>
+        </w:rPr>
+      </w:pPr>
+    </w:p>
+    <w:p>
+      <w:pPr>
+        <w:spacing w:after="0" w:line="240" w:lineRule="auto"/>
+        <w:ind w:left="709"/>
+        <w:rPr>
+          <w:rFonts w:cs="Calibri"/>
+          <w:b/>
+        </w:rPr>
+      </w:pPr>
+    </w:p>
+    <w:p>
+      <w:pPr>
+        <w:spacing w:after="0" w:line="240" w:lineRule="auto"/>
+        <w:ind w:left="709"/>
+        <w:rPr>
+          <w:rFonts w:cs="Calibri"/>
+          <w:b/>
+        </w:rPr>
+      </w:pPr>
+    </w:p>
+    <w:p>
+      <w:pPr>
+        <w:spacing w:after="0" w:line="240" w:lineRule="auto"/>
+        <w:ind w:left="709"/>
+        <w:rPr>
+          <w:rFonts w:cs="Calibri"/>
+          <w:b/>
+        </w:rPr>
+      </w:pPr>
+    </w:p>
+    <w:p>
+      <w:pPr>
+        <w:spacing w:after="0" w:line="240" w:lineRule="auto"/>
+        <w:ind w:left="709"/>
+        <w:rPr>
+          <w:rFonts w:cs="Calibri"/>
+          <w:b/>
+        </w:rPr>
+      </w:pPr>
     </w:p>
     <w:p>
       <w:pPr>
@@ -3457,7 +3762,7 @@
                         <w:txbxContent>
                           <w:p>
                             <w:r>
-                              <w:t>Carga-Planta incubación Sur -San Fernando-1420 kW- Nodo NODE_1080_320357_MI-17145_2</w:t>
+                              <w:t>Carga-Bomba de Agua Residual-juan Santa-—- Cod IGEA-580224223Carga-Bomba de Agua Residual-juan Santa-—- Cod IGEA-580224223</w:t>
                             </w:r>
                             <w:r>
                               <w:t/>
@@ -3616,12 +3921,12 @@
         <w:pStyle w:val="Ttulo3"/>
       </w:pPr>
       <w:r>
-        <w:t>ANÁLISIS DE CARGABILIDAD</w:t>
-      </w:r>
-    </w:p>
-    <w:p>
-      <w:pPr>
-        <w:spacing w:after="120" w:line="240" w:lineRule="auto"/>
+        <w:t>NÁLISIS DE CARGABILIDAD</w:t>
+      </w:r>
+    </w:p>
+    <w:p>
+      <w:pPr>
+        <w:spacing w:after="0" w:line="240" w:lineRule="auto"/>
         <w:ind w:left="709"/>
         <w:jc w:val="both"/>
         <w:rPr>
@@ -3807,7 +4112,7 @@
                         <w:txbxContent>
                           <w:p>
                             <w:r>
-                              <w:t>Carga-Planta incubación Sur -San Fernando-1420 kW- Nodo NODE_1080_320357_MI-17145_2</w:t>
+                              <w:t>Carga-Bomba de Agua Residual-juan Santa-—- Cod IGEA-580224223Carga-Bomba de Agua Residual-juan Santa-—- Cod IGEA-580224223</w:t>
                             </w:r>
                           </w:p>
                         </w:txbxContent>
@@ -4073,7 +4378,7 @@
                 <w:sz w:val="20"/>
                 <w:szCs w:val="20"/>
               </w:rPr>
-              <w:t>99.84%</w:t>
+              <w:t>96.52%</w:t>
             </w:r>
           </w:p>
         </w:tc>
@@ -4149,7 +4454,7 @@
                 <w:sz w:val="20"/>
                 <w:szCs w:val="20"/>
               </w:rPr>
-              <w:t>99.84%</w:t>
+              <w:t>95.99%</w:t>
             </w:r>
           </w:p>
         </w:tc>
@@ -4225,7 +4530,7 @@
                 <w:sz w:val="20"/>
                 <w:szCs w:val="20"/>
               </w:rPr>
-              <w:t>99.84%</w:t>
+              <w:t>96.43%</w:t>
             </w:r>
           </w:p>
         </w:tc>
@@ -4790,7 +5095,7 @@
                 <w:szCs w:val="20"/>
                 <w:lang w:eastAsia="es-PE"/>
               </w:rPr>
-              <w:t>PA217</w:t>
+              <w:t>CA101</w:t>
             </w:r>
           </w:p>
         </w:tc>
@@ -4863,7 +5168,7 @@
                 <w:szCs w:val="20"/>
                 <w:lang w:eastAsia="es-PE"/>
               </w:rPr>
-              <w:t>PA217</w:t>
+              <w:t>CA101</w:t>
             </w:r>
           </w:p>
         </w:tc>
@@ -5431,7 +5736,7 @@
                 <w:szCs w:val="20"/>
                 <w:lang w:eastAsia="es-PE"/>
               </w:rPr>
-              <w:t xml:space="preserve">ESTADO ACTUAL PA217</w:t>
+              <w:t xml:space="preserve">ESTADO ACTUAL CA101</w:t>
             </w:r>
             <w:r>
               <w:rPr>
@@ -5478,7 +5783,7 @@
                 <w:szCs w:val="20"/>
                 <w:lang w:eastAsia="es-PE"/>
               </w:rPr>
-              <w:t>6,498.00</w:t>
+              <w:t>3,022.00</w:t>
             </w:r>
           </w:p>
         </w:tc>
@@ -5514,7 +5819,7 @@
                 <w:szCs w:val="20"/>
                 <w:lang w:eastAsia="es-PE"/>
               </w:rPr>
-              <w:t>42,122,635.20</w:t>
+              <w:t>19,589,812.80</w:t>
             </w:r>
           </w:p>
         </w:tc>
@@ -5626,7 +5931,7 @@
                 <w:szCs w:val="20"/>
                 <w:lang w:eastAsia="es-PE"/>
               </w:rPr>
-              <w:t>-54,419.07</w:t>
+              <w:t>-33,443.34</w:t>
             </w:r>
           </w:p>
         </w:tc>
@@ -5669,7 +5974,7 @@
                 <w:lang w:eastAsia="es-PE"/>
               </w:rPr>
               <w:lastRenderedPageBreak/>
-              <w:t xml:space="preserve">ESTADO PROYECTADO PA217</w:t>
+              <w:t xml:space="preserve">ESTADO PROYECTADO CA101</w:t>
             </w:r>
             <w:r>
               <w:rPr>
@@ -5716,7 +6021,7 @@
                 <w:szCs w:val="20"/>
                 <w:lang w:eastAsia="es-PE"/>
               </w:rPr>
-              <w:t>6,498.00</w:t>
+              <w:t>3,233.12</w:t>
             </w:r>
           </w:p>
         </w:tc>
@@ -5752,7 +6057,7 @@
                 <w:szCs w:val="20"/>
                 <w:lang w:eastAsia="es-PE"/>
               </w:rPr>
-              <w:t>42,122,635.20</w:t>
+              <w:t>20,958,377.09</w:t>
             </w:r>
           </w:p>
         </w:tc>
@@ -5788,7 +6093,7 @@
                 <w:szCs w:val="20"/>
                 <w:lang w:eastAsia="es-PE"/>
               </w:rPr>
-              <w:t>0.00</w:t>
+              <w:t>505,500.00</w:t>
             </w:r>
           </w:p>
         </w:tc>
@@ -5828,7 +6133,7 @@
                 <w:szCs w:val="20"/>
                 <w:lang w:eastAsia="es-PE"/>
               </w:rPr>
-              <w:t>0.00%</w:t>
+              <w:t>2.41%</w:t>
             </w:r>
           </w:p>
         </w:tc>
@@ -5864,7 +6169,7 @@
                 <w:szCs w:val="20"/>
                 <w:lang w:eastAsia="es-PE"/>
               </w:rPr>
-              <w:t>-54,419.07</w:t>
+              <w:t>80,839.13</w:t>
             </w:r>
           </w:p>
         </w:tc>
@@ -5901,7 +6206,7 @@
         <w:rPr>
           <w:rFonts w:cs="Calibri"/>
         </w:rPr>
-        <w:t xml:space="preserve">De acuerdo con el registro de las máximas demandas de la barra de 10 kV (B-SP1T1) del año 2025, los reportes IDOS y los estudios de flujo de potencia desarrollados en DIgSILENT PowerFactory v24 para el escenario 2026 del modelo AD8 - PIT 2025-2029, el transformador de potencia de la SET Paracas alcanza una cargabilidad de 72,28 % en el devanado de 10 kV en el escenario sin proyecto y de 73,87 % en el escenario con proyecto como se observa en la figura. Estos niveles de carga se encuentran por debajo de la capacidad nominal del equipo, evidenciando que actualmente opera en condiciones adecuadas y sin presentar problemas de sobrecarga.</w:t>
+        <w:t xml:space="preserve">De acuerdo con el registro de las máximas demandas de la barra de 10 kV (B-SP1T1) del año 2025, los reportes IDOS y los estudios de flujo de potencia desarrollados en DIgSILENT PowerFactory v24 para el escenario 2026 del modelo AD8 - PIT 2025-2029, el transformador de potencia de la SET CA101 alcanza una cargabilidad de 72,28 % en el devanado de 10 kV en el escenario sin proyecto y de 73,87 % en el escenario con proyecto como se observa en la figura. Estos niveles de carga se encuentran por debajo de la capacidad nominal del equipo, evidenciando que actualmente opera en condiciones adecuadas y sin presentar problemas de sobrecarga.</w:t>
       </w:r>
       <w:proofErr w:type="spellStart"/>
       <w:r>
@@ -6366,7 +6671,7 @@
         <w:jc w:val="center"/>
       </w:pPr>
       <w:r>
-        <w:t xml:space="preserve">Figura 1:Cargabilidad de 73.87% en el devanado de 10 kV de la SET Paracas -T5261 Transformador SET Paracas · 22.9 kV (inventario CYMDIST)-220/60/10KV</w:t>
+        <w:t xml:space="preserve">Figura 1:Cargabilidad de 73.87% en el devanado de 10 kV de la SET CA101 -T5261 Transformador SET CA101 · 10.0 kV (inventario CYMDIST)-220/60/10KV</w:t>
       </w:r>
       <w:r>
         <w:fldChar w:fldCharType="begin"/>
@@ -6447,7 +6752,7 @@
         <w:rPr>
           <w:rFonts w:cs="Calibri"/>
         </w:rPr>
-        <w:t xml:space="preserve">La solicitud de factibilidad y asignación de punto de diseño presentada por el predio San Fernando S.A (RUC 20100154308), para una demanda de 1420 kW, se encuentra dentro del área de concesión de la empresa distribuidora.</w:t>
+        <w:t xml:space="preserve">La solicitud de factibilidad y asignación de punto de diseño presentada por el predio MUNICIPAL DE AGUA POTABLE Y ALCANTARILLADO DE ICA S.A. - EMAPICA, para una demanda de —, se encuentra dentro del área de concesión de la empresa distribuidora.</w:t>
       </w:r>
       <w:r>
         <w:rPr>
@@ -6496,7 +6801,7 @@
           <w:szCs w:val="21"/>
           <w:lang w:eastAsia="es-PE"/>
         </w:rPr>
-        <w:t xml:space="preserve">De acuerdo con los análisis de cargabilidad y calidad de producto realizados sobre el alimentador PA217 (estados situacional y proyectado), se verifica que la red mantiene niveles de tensión y cargabilidad dentro de los parámetros operativos permitidos para la demanda solicitada.</w:t>
+        <w:t xml:space="preserve">De acuerdo con los análisis de cargabilidad y calidad de producto realizados, no es posible asignar el punto de diseño en el alimentador CA101, debido a que este presenta niveles de cargabilidad cercanos a su capacidad máxima de operación y condiciones de caída de tensión próximas a los límites permisibles establecidos por la normativa vigente</w:t>
       </w:r>
       <w:proofErr w:type="spellStart"/>
       <w:r>
@@ -6579,7 +6884,7 @@
         <w:rPr>
           <w:rFonts w:cs="Calibri"/>
         </w:rPr>
-        <w:t xml:space="preserve">Asimismo, se evaluó el estado actual (sin proyecto) y proyectado (con proyecto) de cargabilidad y calidad de producto del alimentador PA217 y de la SET Paracas, determinándose que cuentan con condiciones operativas favorables para la incorporación de la nueva carga solicitada. Los resultados del flujo de carga evidencian capacidad suficiente para atender la demanda requerida y mantienen niveles de tensión dentro de los rangos establecidos por la normativa vigente.</w:t>
+        <w:t xml:space="preserve">Asimismo, se evaluó el estado actual de cargabilidad y calidad de producto del alimentador CA101 y del transformador de potencia de la SET CA101, determinándose que ambos cuentan con condiciones operativas favorables para la incorporación de la nueva carga solicitada. Los resultados obtenidos evidencian que el alimentador CA101 dispone de capacidad suficiente para atender la demanda requerida y mantiene niveles de tensión dentro de los rangos establecidos por la normativa vigente. De igual manera, el transformador de potencia de la SET CA101 presenta disponibilidad de capacidad, garantizando una operación segura y confiable del sistema.</w:t>
       </w:r>
       <w:proofErr w:type="spellStart"/>
       <w:r>
@@ -6620,7 +6925,7 @@
         <w:rPr>
           <w:rFonts w:cs="Calibri"/>
         </w:rPr>
-        <w:t>En consecuencia, para la atención de la demanda requerida por el predio San Fernando S.A (RUC 20100154308), se recomienda asignar el punto de diseño en el nodo NODE_1080_320357_MI-17145_2 del alimentador PA217 (punto de conexión de la nueva carga en CYMDIST). Asimismo, se verifica que tanto el alimentador como el transformador de potencia de la SET Paracas cuentan con capacidad disponible para el suministro solicitado, manteniéndose los niveles de tensión dentro de los límites permisibles y sin afectar la calidad de producto ni las condiciones operativas de la red eléctrica.</w:t>
+        <w:t>En consecuencia, para la atención de la demanda requerida por el predio MUNICIPAL DE AGUA POTABLE Y ALCANTARILLADO DE ICA S.A. - EMAPICA, se recomienda asignar el punto de diseño en la estructura de media tensión NMT N.° COD IGEA: 580224223. Asimismo, se verifica que tanto el alimentador CA101 como el transformador de potencia de la SET CA101 cuentan con capacidad disponible para el suministro solicitado, manteniéndose los niveles de tensión dentro de los límites permisibles y sin afectar la calidad de producto ni las condiciones operativas de la red eléctrica</w:t>
       </w:r>
       <w:r>
         <w:rPr>
@@ -7559,7 +7864,7 @@
               <w:sz w:val="20"/>
               <w:szCs w:val="20"/>
             </w:rPr>
-            <w:t xml:space="preserve">SOLICITUD FACTIBILIDAD AMPLIACION DE CARGA, PREDIO San Fernando S.A (RUC 20100154308)</w:t>
+            <w:t xml:space="preserve">SOLICITUD FACTIBILIDAD AMPLIACION DE CARGA, PREDIO MUNICIPAL DE AGUA POTABLE Y ALCANTARILLADO DE ICA S.A. - EMAPICA</w:t>
           </w:r>
           <w:r>
             <w:rPr>

</xml_diff>